<commit_message>
Translate team responsibility report into English
Rewrite the Markdown and Word documents so the AY2526-FYP-B05 work allocation report is fully in English.

Co-authored-by: Leospace001 <Leospace001@users.noreply.github.com>
</commit_message>
<xml_diff>
--- a/docs/AY2526-FYP-B05_Team_Responsibility_Report.docx
+++ b/docs/AY2526-FYP-B05_Team_Responsibility_Report.docx
@@ -8,7 +8,7 @@
         <w:jc w:val="center"/>
       </w:pPr>
       <w:r>
-        <w:t>AY2526-FYP-B05 團隊職責分工報告</w:t>
+        <w:t>AY2526-FYP-B05 Team Responsibility Report</w:t>
       </w:r>
     </w:p>
     <w:p>
@@ -19,7 +19,7 @@
         <w:rPr>
           <w:b/>
         </w:rPr>
-        <w:t>Project: AY2526-FYP-B05（Leospace / Plant E-Commerce Platform）</w:t>
+        <w:t>Project: AY2526-FYP-B05 (Leospace / Plant E-Commerce Platform)</w:t>
         <w:br/>
       </w:r>
       <w:r>
@@ -38,12 +38,12 @@
         <w:rPr>
           <w:color w:val="1A3A5C"/>
         </w:rPr>
-        <w:t>1. 報告目的</w:t>
+        <w:t>1. Purpose</w:t>
       </w:r>
     </w:p>
     <w:p>
       <w:r>
-        <w:t>本報告說明 AY2526-FYP-B05 專案三位組員的職責分工，對應系統中的主要技術模組與功能範圍，方便評審、進度檢視與後續維護時清楚知道各部分負責人。</w:t>
+        <w:t>This report describes the work allocation among the three members of the AY2526-FYP-B05 project. It maps each member to the main technical modules and feature areas of the system so that reviewers, progress tracking, and future maintenance can clearly identify ownership.</w:t>
       </w:r>
     </w:p>
     <w:p>
@@ -54,17 +54,17 @@
         <w:rPr>
           <w:color w:val="1A3A5C"/>
         </w:rPr>
-        <w:t>2. 專案概覽</w:t>
+        <w:t>2. Project Overview</w:t>
       </w:r>
     </w:p>
     <w:p>
       <w:r>
-        <w:t>本系統為一個以植物／商品為核心的 Web 應用。主要技術架構包括：Frontend（React + Vite）、Backend（Java Spring Boot）、Database（PostgreSQL）、Message Queue（RabbitMQ）、Reverse Proxy（NGINX）、Deployment（Docker / Docker Compose），以及 AI Services（Google Gemini、Kindwise Plant.id）。</w:t>
+        <w:t>This system is a plant / product–focused web application. The main technology stack includes: Frontend (React + Vite), Backend (Java Spring Boot), Database (PostgreSQL), Message Queue (RabbitMQ), Reverse Proxy (NGINX), Deployment (Docker / Docker Compose), and AI Services (Google Gemini, Kindwise Plant.id).</w:t>
       </w:r>
     </w:p>
     <w:p>
       <w:r>
-        <w:t>系統支援使用者註冊登入、商品／庫存管理、購物車與訂單、電郵通知、群組聊天，以及 AI 植物識別與分析等功能。</w:t>
+        <w:t>Key features include user registration and login, product / inventory management, shopping cart and orders, email notifications, group chat, and AI plant identification and analysis.</w:t>
       </w:r>
     </w:p>
     <w:p>
@@ -75,7 +75,7 @@
         <w:rPr>
           <w:color w:val="1A3A5C"/>
         </w:rPr>
-        <w:t>3. 組員職責總表</w:t>
+        <w:t>3. Responsibility Summary</w:t>
       </w:r>
     </w:p>
     <w:tbl>
@@ -98,7 +98,7 @@
               <w:rPr>
                 <w:b/>
               </w:rPr>
-              <w:t>組員</w:t>
+              <w:t>Member</w:t>
             </w:r>
           </w:p>
         </w:tc>
@@ -111,7 +111,7 @@
               <w:rPr>
                 <w:b/>
               </w:rPr>
-              <w:t>主要職責</w:t>
+              <w:t>Main Responsibilities</w:t>
             </w:r>
           </w:p>
         </w:tc>
@@ -133,7 +133,7 @@
           </w:tcPr>
           <w:p>
             <w:r>
-              <w:t>AI（Google Gemini、Kindwise AI）、Checkbox with AI 分析</w:t>
+              <w:t>AI (Google Gemini, Kindwise AI), Checkbox with AI Analysis</w:t>
             </w:r>
           </w:p>
         </w:tc>
@@ -155,7 +155,7 @@
           </w:tcPr>
           <w:p>
             <w:r>
-              <w:t>PostgreSQL 資料庫</w:t>
+              <w:t>PostgreSQL database</w:t>
             </w:r>
           </w:p>
         </w:tc>
@@ -177,7 +177,7 @@
           </w:tcPr>
           <w:p>
             <w:r>
-              <w:t>Java Spring Boot、NGINX、RabbitMQ、Docker、React、Vite</w:t>
+              <w:t>Java Spring Boot, NGINX, RabbitMQ, Docker, React, Vite</w:t>
             </w:r>
           </w:p>
         </w:tc>
@@ -191,7 +191,7 @@
         <w:rPr>
           <w:color w:val="1A3A5C"/>
         </w:rPr>
-        <w:t>4. 組員職責詳述</w:t>
+        <w:t>4. Detailed Responsibilities</w:t>
       </w:r>
     </w:p>
     <w:p>
@@ -202,12 +202,12 @@
         <w:rPr>
           <w:color w:val="1A3A5C"/>
         </w:rPr>
-        <w:t>4.1 WONG Shi Yin Andy — AI 模組</w:t>
+        <w:t>4.1 WONG Shi Yin Andy — AI Module</w:t>
       </w:r>
     </w:p>
     <w:p>
       <w:r>
-        <w:t>負責範圍：Google Gemini、Kindwise AI，以及 Checkbox with AI 分析相關功能。</w:t>
+        <w:t>Scope: Google Gemini, Kindwise AI, and Checkbox with AI Analysis.</w:t>
       </w:r>
     </w:p>
     <w:p>
@@ -218,7 +218,7 @@
         <w:rPr>
           <w:color w:val="1A3A5C"/>
         </w:rPr>
-        <w:t>4.1.1 Kindwise AI（Plant.id）</w:t>
+        <w:t>4.1.1 Kindwise AI (Plant.id)</w:t>
       </w:r>
     </w:p>
     <w:p>
@@ -226,7 +226,7 @@
         <w:pStyle w:val="ListBullet"/>
       </w:pPr>
       <w:r>
-        <w:t>負責植物影像識別流程：使用者上傳植物相片後，呼叫 Kindwise / Plant.id API（api.plant.id）進行物種辨識。</w:t>
+        <w:t>Owns the plant image identification flow: after a user uploads a plant photo, the system calls the Kindwise / Plant.id API (api.plant.id) for species recognition.</w:t>
       </w:r>
     </w:p>
     <w:p>
@@ -234,7 +234,7 @@
         <w:pStyle w:val="ListBullet"/>
       </w:pPr>
       <w:r>
-        <w:t>對應前端頁面：Plant Identifier（AI Plant Identifier）。</w:t>
+        <w:t>Corresponding frontend page: Plant Identifier (AI Plant Identifier).</w:t>
       </w:r>
     </w:p>
     <w:p>
@@ -242,7 +242,7 @@
         <w:pStyle w:val="ListBullet"/>
       </w:pPr>
       <w:r>
-        <w:t>主要工作：圖片上傳與格式驗證（JPG / PNG）、呼叫 Kindwise identification API、顯示辨識結果（植物名稱）、根據辨識結果聯動相關商品建議。</w:t>
+        <w:t>Main tasks: image upload and format validation (JPG / PNG), calling the Kindwise identification API, displaying identification results (plant name), and suggesting related products based on the identification result.</w:t>
       </w:r>
     </w:p>
     <w:p>
@@ -261,7 +261,7 @@
         <w:pStyle w:val="ListBullet"/>
       </w:pPr>
       <w:r>
-        <w:t>負責 Gemini 對話與植物深度分析（Gemini Chat：/api/chat/gemini）。</w:t>
+        <w:t>Owns Gemini chat and in-depth plant analysis (Gemini Chat: /api/chat/gemini).</w:t>
       </w:r>
     </w:p>
     <w:p>
@@ -269,7 +269,7 @@
         <w:pStyle w:val="ListBullet"/>
       </w:pPr>
       <w:r>
-        <w:t>植物辨識後的詳細分析：中醫藥性、風水佈局、節慶寓意。</w:t>
+        <w:t>Post-identification detailed analysis: medicinal properties, feng shui placement, and festive meaning.</w:t>
       </w:r>
     </w:p>
     <w:p>
@@ -277,7 +277,7 @@
         <w:pStyle w:val="ListBullet"/>
       </w:pPr>
       <w:r>
-        <w:t>與後端 Gemini proxy／service 整合，確保 API Key、model、proxy 設定可用。</w:t>
+        <w:t>Integrates with the backend Gemini proxy / service, including API key, model, and proxy configuration.</w:t>
       </w:r>
     </w:p>
     <w:p>
@@ -288,7 +288,7 @@
         <w:rPr>
           <w:color w:val="1A3A5C"/>
         </w:rPr>
-        <w:t>4.1.3 Checkbox with AI 分析</w:t>
+        <w:t>4.1.3 Checkbox with AI Analysis</w:t>
       </w:r>
     </w:p>
     <w:p>
@@ -296,7 +296,7 @@
         <w:pStyle w:val="ListBullet"/>
       </w:pPr>
       <w:r>
-        <w:t>負責「Checkbox with AI 分析」互動功能：以勾選方式讓使用者選擇需要的 AI 分析項目，再觸發對應的 Gemini／Kindwise 分析結果顯示。</w:t>
+        <w:t>Owns the Checkbox with AI Analysis interaction: users select the AI analysis options they need via checkboxes, then trigger the corresponding Gemini / Kindwise analysis results.</w:t>
       </w:r>
     </w:p>
     <w:p>
@@ -304,7 +304,7 @@
         <w:pStyle w:val="ListBullet"/>
       </w:pPr>
       <w:r>
-        <w:t>結合 AI Plant Identifier 與 Gemini 分析結果，提供可選擇、可擴展的 AI 分析體驗。</w:t>
+        <w:t>Combines the AI Plant Identifier with Gemini analysis results to provide a selectable and extensible AI analysis experience.</w:t>
       </w:r>
     </w:p>
     <w:p>
@@ -312,7 +312,7 @@
         <w:rPr>
           <w:b/>
         </w:rPr>
-        <w:t>相關檔案／模組：</w:t>
+        <w:t>Related files / modules:</w:t>
       </w:r>
     </w:p>
     <w:p>
@@ -336,7 +336,7 @@
         <w:pStyle w:val="ListBullet"/>
       </w:pPr>
       <w:r>
-        <w:t>ui/src/pages/OllamaChat.tsx（Gemini Chat UI）</w:t>
+        <w:t>ui/src/pages/OllamaChat.tsx (Gemini Chat UI)</w:t>
       </w:r>
     </w:p>
     <w:p>
@@ -368,7 +368,7 @@
     </w:p>
     <w:p>
       <w:r>
-        <w:t>負責範圍：PostgreSQL 資料庫設計、維護與系統資料持久化。</w:t>
+        <w:t>Scope: PostgreSQL database design, maintenance, and system data persistence.</w:t>
       </w:r>
     </w:p>
     <w:p>
@@ -379,7 +379,7 @@
         <w:rPr>
           <w:color w:val="1A3A5C"/>
         </w:rPr>
-        <w:t>主要工作</w:t>
+        <w:t>Main Tasks</w:t>
       </w:r>
     </w:p>
     <w:p>
@@ -387,7 +387,7 @@
         <w:pStyle w:val="ListBullet"/>
       </w:pPr>
       <w:r>
-        <w:t>設計並維護 PostgreSQL schema，配合 Spring Data JPA entity 模型。</w:t>
+        <w:t>Design and maintain the PostgreSQL schema in alignment with Spring Data JPA entity models.</w:t>
       </w:r>
     </w:p>
     <w:p>
@@ -395,7 +395,7 @@
         <w:pStyle w:val="ListBullet"/>
       </w:pPr>
       <w:r>
-        <w:t>確保核心業務資料正確儲存與關聯，例如：使用者與角色、商品／庫存、購物車與訂單、運送地址與付款方式、電郵紀錄與範本、群組聊天、員工與活動紀錄等。</w:t>
+        <w:t>Ensure core business data is stored correctly and relationships remain consistent, including users and roles, products / inventory, shopping cart and orders, delivery addresses and payment methods, email records and templates, group chat, employee and activity / logging tables, and other business entities.</w:t>
       </w:r>
     </w:p>
     <w:p>
@@ -403,7 +403,7 @@
         <w:pStyle w:val="ListBullet"/>
       </w:pPr>
       <w:r>
-        <w:t>配合 Docker Compose 中的 db（PostgreSQL 15）服務部署與連線設定。</w:t>
+        <w:t>Support deployment and connection settings for the db service (PostgreSQL 15) in Docker Compose.</w:t>
       </w:r>
     </w:p>
     <w:p>
@@ -411,7 +411,7 @@
         <w:pStyle w:val="ListBullet"/>
       </w:pPr>
       <w:r>
-        <w:t>透過 Adminer（http://localhost:7070/）支援開發／測試時的資料庫檢視與除錯。</w:t>
+        <w:t>Support database inspection and debugging via Adminer (http://localhost:7070/) during development and testing.</w:t>
       </w:r>
     </w:p>
     <w:p>
@@ -419,7 +419,7 @@
         <w:pStyle w:val="ListBullet"/>
       </w:pPr>
       <w:r>
-        <w:t>協助處理 schema migration、資料完整性與關聯正確性。</w:t>
+        <w:t>Assist with schema migration, data integrity, and relationship correctness.</w:t>
       </w:r>
     </w:p>
     <w:p>
@@ -427,7 +427,7 @@
         <w:rPr>
           <w:b/>
         </w:rPr>
-        <w:t>相關設定／模組：</w:t>
+        <w:t>Related configuration / modules:</w:t>
       </w:r>
     </w:p>
     <w:p>
@@ -435,7 +435,7 @@
         <w:pStyle w:val="ListBullet"/>
       </w:pPr>
       <w:r>
-        <w:t>docker-compose.yml → db service（postgres:15.3-alpine）</w:t>
+        <w:t>docker-compose.yml → db service (postgres:15.3-alpine)</w:t>
       </w:r>
     </w:p>
     <w:p>
@@ -443,7 +443,7 @@
         <w:pStyle w:val="ListBullet"/>
       </w:pPr>
       <w:r>
-        <w:t>Spring datasource：jdbc:postgresql://db:5432/postgres</w:t>
+        <w:t>Spring datasource: jdbc:postgresql://db:5432/postgres</w:t>
       </w:r>
     </w:p>
     <w:p>
@@ -451,7 +451,7 @@
         <w:pStyle w:val="ListBullet"/>
       </w:pPr>
       <w:r>
-        <w:t>JPA models：src/main/java/com/example/demo/model/*</w:t>
+        <w:t>JPA models: src/main/java/com/example/demo/model/*</w:t>
       </w:r>
     </w:p>
     <w:p>
@@ -459,7 +459,7 @@
         <w:pStyle w:val="ListBullet"/>
       </w:pPr>
       <w:r>
-        <w:t>UML / schema：uml/classDiagram.*、docs/sample-schema.md</w:t>
+        <w:t>UML / schema: uml/classDiagram.*, docs/sample-schema.md</w:t>
       </w:r>
     </w:p>
     <w:p>
@@ -470,12 +470,12 @@
         <w:rPr>
           <w:color w:val="1A3A5C"/>
         </w:rPr>
-        <w:t>4.3 YUEN Chiu Chun — 全端核心架構與基礎設施</w:t>
+        <w:t>4.3 YUEN Chiu Chun — Core Full-Stack Architecture &amp; Infrastructure</w:t>
       </w:r>
     </w:p>
     <w:p>
       <w:r>
-        <w:t>負責範圍：Java Spring Boot、NGINX、RabbitMQ、Docker、React、Vite。</w:t>
+        <w:t>Scope: Java Spring Boot, NGINX, RabbitMQ, Docker, React, and Vite.</w:t>
       </w:r>
     </w:p>
     <w:p>
@@ -486,7 +486,7 @@
         <w:rPr>
           <w:color w:val="1A3A5C"/>
         </w:rPr>
-        <w:t>4.3.1 Java Spring Boot（Backend）</w:t>
+        <w:t>4.3.1 Java Spring Boot (Backend)</w:t>
       </w:r>
     </w:p>
     <w:p>
@@ -494,7 +494,7 @@
         <w:pStyle w:val="ListBullet"/>
       </w:pPr>
       <w:r>
-        <w:t>負責後端 API、業務邏輯、安全性與系統整合。</w:t>
+        <w:t>Owns backend APIs, business logic, security, and system integration.</w:t>
       </w:r>
     </w:p>
     <w:p>
@@ -502,7 +502,7 @@
         <w:pStyle w:val="ListBullet"/>
       </w:pPr>
       <w:r>
-        <w:t>涵蓋：Authentication / OAuth2 / JWT、User、Product／Stock、Cart、Order、Email、Chat／WebSocket、Admin、Gemini backend proxy 等。</w:t>
+        <w:t>Coverage includes Authentication / OAuth2 / JWT, User, Product / Stock, Cart, Order, Email, Chat / WebSocket, Admin, Gemini backend proxy, and other REST endpoints.</w:t>
       </w:r>
     </w:p>
     <w:p>
@@ -510,7 +510,7 @@
         <w:pStyle w:val="ListBullet"/>
       </w:pPr>
       <w:r>
-        <w:t>維護 Maven 專案結構（pom.xml）與 Spring Boot 設定（application.yml）。</w:t>
+        <w:t>Maintains the Maven project structure (pom.xml) and Spring Boot configuration (application.yml).</w:t>
       </w:r>
     </w:p>
     <w:p>
@@ -529,7 +529,7 @@
         <w:pStyle w:val="ListBullet"/>
       </w:pPr>
       <w:r>
-        <w:t>負責反向代理與對外 HTTP／HTTPS 流量路由。</w:t>
+        <w:t>Owns reverse proxy and external HTTP / HTTPS traffic routing.</w:t>
       </w:r>
     </w:p>
     <w:p>
@@ -537,7 +537,7 @@
         <w:pStyle w:val="ListBullet"/>
       </w:pPr>
       <w:r>
-        <w:t>設定 SSL（Let's Encrypt / Certbot）與前端／後端反向代理規則。</w:t>
+        <w:t>Configures SSL (Let's Encrypt / Certbot) and reverse-proxy rules for frontend and backend.</w:t>
       </w:r>
     </w:p>
     <w:p>
@@ -545,7 +545,7 @@
         <w:pStyle w:val="ListBullet"/>
       </w:pPr>
       <w:r>
-        <w:t>對應設定：nginx/default.conf、nginx/dev.conf。</w:t>
+        <w:t>Related configuration: nginx/default.conf, nginx/dev.conf.</w:t>
       </w:r>
     </w:p>
     <w:p>
@@ -564,7 +564,7 @@
         <w:pStyle w:val="ListBullet"/>
       </w:pPr>
       <w:r>
-        <w:t>負責訊息佇列整合，支援非同步處理（例如電郵寄送）。</w:t>
+        <w:t>Owns message-queue integration for asynchronous processing (for example, email dispatch).</w:t>
       </w:r>
     </w:p>
     <w:p>
@@ -572,7 +572,7 @@
         <w:pStyle w:val="ListBullet"/>
       </w:pPr>
       <w:r>
-        <w:t>配置 Spring AMQP／RabbitMQ producer／consumer。</w:t>
+        <w:t>Configures Spring AMQP / RabbitMQ producers and consumers.</w:t>
       </w:r>
     </w:p>
     <w:p>
@@ -580,7 +580,7 @@
         <w:pStyle w:val="ListBullet"/>
       </w:pPr>
       <w:r>
-        <w:t>Docker 服務：rabbitmq:3-management（含 Management UI）。</w:t>
+        <w:t>Docker service: rabbitmq:3-management (including Management UI).</w:t>
       </w:r>
     </w:p>
     <w:p>
@@ -599,7 +599,7 @@
         <w:pStyle w:val="ListBullet"/>
       </w:pPr>
       <w:r>
-        <w:t>負責整個系統的容器化部署與編排。</w:t>
+        <w:t>Owns containerization and orchestration for the whole system.</w:t>
       </w:r>
     </w:p>
     <w:p>
@@ -607,7 +607,7 @@
         <w:pStyle w:val="ListBullet"/>
       </w:pPr>
       <w:r>
-        <w:t>維護 Dockerfile、docker-compose.yml、docker-compose.dev.yml。</w:t>
+        <w:t>Maintains Dockerfile, docker-compose.yml, and docker-compose.dev.yml.</w:t>
       </w:r>
     </w:p>
     <w:p>
@@ -615,7 +615,7 @@
         <w:pStyle w:val="ListBullet"/>
       </w:pPr>
       <w:r>
-        <w:t>協調多服務啟動：nginx、app（Spring）、ui、db、rabbitmq、adminer 等。</w:t>
+        <w:t>Coordinates multi-service startup: nginx, app (Spring), ui, db, rabbitmq, adminer, and related services.</w:t>
       </w:r>
     </w:p>
     <w:p>
@@ -626,7 +626,7 @@
         <w:rPr>
           <w:color w:val="1A3A5C"/>
         </w:rPr>
-        <w:t>4.3.5 React + Vite（Frontend）</w:t>
+        <w:t>4.3.5 React + Vite (Frontend)</w:t>
       </w:r>
     </w:p>
     <w:p>
@@ -634,7 +634,7 @@
         <w:pStyle w:val="ListBullet"/>
       </w:pPr>
       <w:r>
-        <w:t>負責前端應用架構與主要業務頁面（React + Vite + TypeScript）。</w:t>
+        <w:t>Owns the frontend application architecture and major business pages (React + Vite + TypeScript).</w:t>
       </w:r>
     </w:p>
     <w:p>
@@ -642,7 +642,7 @@
         <w:pStyle w:val="ListBullet"/>
       </w:pPr>
       <w:r>
-        <w:t>涵蓋登入註冊、商品、購物車、訂單、電郵、管理後台、群組聊天等 UI。</w:t>
+        <w:t>Coverage includes login / registration, products, cart, orders, email, admin panel, group chat, and related UI.</w:t>
       </w:r>
     </w:p>
     <w:p>
@@ -650,7 +650,7 @@
         <w:pStyle w:val="ListBullet"/>
       </w:pPr>
       <w:r>
-        <w:t>維護前端建置與容器化（ui/ 專案、vite.config.ts）。</w:t>
+        <w:t>Maintains frontend build and containerization (ui/ project, vite.config.ts).</w:t>
       </w:r>
     </w:p>
     <w:p>
@@ -661,7 +661,7 @@
         <w:rPr>
           <w:color w:val="1A3A5C"/>
         </w:rPr>
-        <w:t>5. 協作關係說明</w:t>
+        <w:t>5. Collaboration Notes</w:t>
       </w:r>
     </w:p>
     <w:p>
@@ -669,7 +669,7 @@
         <w:pStyle w:val="ListNumber"/>
       </w:pPr>
       <w:r>
-        <w:t>Andy 完成 AI 辨識與分析後，前端可呼叫 Yuen 維護的 Spring Boot API／Gemini proxy，以及顯示相關商品資料。</w:t>
+        <w:t>After Andy completes AI identification and analysis, the frontend can call the Spring Boot API / Gemini proxy maintained by Yuen, and display related product data.</w:t>
       </w:r>
     </w:p>
     <w:p>
@@ -677,7 +677,7 @@
         <w:pStyle w:val="ListNumber"/>
       </w:pPr>
       <w:r>
-        <w:t>Fan 負責的 PostgreSQL 為整站資料基礎；Yuen 的 Spring Boot JPA／Repository 層與資料庫互動。</w:t>
+        <w:t>The PostgreSQL database owned by Fan is the data foundation for the whole site; Yuen's Spring Boot JPA / repository layer interacts with that database.</w:t>
       </w:r>
     </w:p>
     <w:p>
@@ -685,7 +685,7 @@
         <w:pStyle w:val="ListNumber"/>
       </w:pPr>
       <w:r>
-        <w:t>Yuen 負責的 Docker／NGINX／RabbitMQ 把前端、後端、資料庫與訊息佇列組成可部署的完整系統。</w:t>
+        <w:t>Yuen's Docker / NGINX / RabbitMQ work connects the frontend, backend, database, and message queue into a deployable system.</w:t>
       </w:r>
     </w:p>
     <w:p>
@@ -693,7 +693,7 @@
         <w:pStyle w:val="ListNumber"/>
       </w:pPr>
       <w:r>
-        <w:t>三人分工清楚：AI 功能、資料庫、以及核心全端架構／基礎設施各自負責，共同完成 FYP 系統交付。</w:t>
+        <w:t>Ownership is clear across three areas — AI features, database, and core full-stack architecture / infrastructure — enabling the team to deliver the FYP system together.</w:t>
       </w:r>
     </w:p>
     <w:p>
@@ -704,7 +704,7 @@
         <w:rPr>
           <w:color w:val="1A3A5C"/>
         </w:rPr>
-        <w:t>6. 總結</w:t>
+        <w:t>6. Summary</w:t>
       </w:r>
     </w:p>
     <w:tbl>
@@ -727,7 +727,7 @@
               <w:rPr>
                 <w:b/>
               </w:rPr>
-              <w:t>組員</w:t>
+              <w:t>Member</w:t>
             </w:r>
           </w:p>
         </w:tc>
@@ -740,7 +740,7 @@
               <w:rPr>
                 <w:b/>
               </w:rPr>
-              <w:t>一句總結</w:t>
+              <w:t>One-line Summary</w:t>
             </w:r>
           </w:p>
         </w:tc>
@@ -762,7 +762,7 @@
           </w:tcPr>
           <w:p>
             <w:r>
-              <w:t>負責專案 AI 能力：Kindwise 植物識別、Gemini 深度分析，以及 Checkbox with AI 分析功能。</w:t>
+              <w:t>Owns the project's AI capabilities: Kindwise plant identification, Gemini in-depth analysis, and Checkbox with AI Analysis.</w:t>
             </w:r>
           </w:p>
         </w:tc>
@@ -784,7 +784,7 @@
           </w:tcPr>
           <w:p>
             <w:r>
-              <w:t>負責 PostgreSQL 資料庫設計、儲存與維護，支撐全站業務資料。</w:t>
+              <w:t>Owns PostgreSQL database design, storage, and maintenance that support all business data.</w:t>
             </w:r>
           </w:p>
         </w:tc>
@@ -806,7 +806,7 @@
           </w:tcPr>
           <w:p>
             <w:r>
-              <w:t>負責系統主幹：Spring Boot 後端、React/Vite 前端、NGINX、RabbitMQ 與 Docker 部署。</w:t>
+              <w:t>Owns the system backbone: Spring Boot backend, React/Vite frontend, NGINX, RabbitMQ, and Docker deployment.</w:t>
             </w:r>
           </w:p>
         </w:tc>
@@ -815,7 +815,7 @@
     <w:p/>
     <w:p>
       <w:r>
-        <w:t>本分工確保 AI、資料庫與系統架構三個關鍵面向皆有明確負責人，有利於開發、測試、演示與最終報告撰寫。</w:t>
+        <w:t>This allocation ensures clear ownership of the three critical areas — AI, database, and system architecture — and supports development, testing, demonstration, and final report writing.</w:t>
       </w:r>
     </w:p>
     <w:p>
@@ -824,7 +824,7 @@
           <w:i/>
         </w:rPr>
         <w:br/>
-        <w:t>Document generated for AY2526-FYP-B05 team responsibility reporting.</w:t>
+        <w:t>Document prepared for AY2526-FYP-B05 team responsibility reporting.</w:t>
       </w:r>
     </w:p>
     <w:sectPr>

</xml_diff>